<commit_message>
S3: 5T paid-feed Pro-gate + non-rolling grant; canon/EULA/patent docs tracked (CC-004)
</commit_message>
<xml_diff>
--- a/Patents/TrustSquare_IP_Brief_v6_DRAFT.docx
+++ b/Patents/TrustSquare_IP_Brief_v6_DRAFT.docx
@@ -46,6 +46,11 @@
     <w:p>
       <w:r>
         <w:t>CPA s63 position IMPROVES (supersedes v5 §8.1’s burn-at-request framing): on decline the buyer’s hold is released in full, so the “buyer receives nothing on decline” limb falls away entirely; the “time-based forfeiture of unspent float” limb is unchanged (dormancy-expiry fix stands). Strict cash non-refundability is preserved throughout — a release frees un-spent Tuppence; it never converts to cash.</w:t>
+      </w:r>
+    </w:p>
+    <w:p>
+      <w:r>
+        <w:t>S3 access-tier gate + non-rolling grant (added 17 Jun 2026, built same day; canon PRICING_CANON.md §5). The expensive paid-feed AI class is reserved to the $20 Pro tier, enforced at /tuppence/ai-commit before any hold is placed; and granted (non-purchased) Tuppence is non-rolling — unspent grant is swept to zero at each fresh monthly allocation via a grant_expiry ledger entry. Patent treatment (David ruling 17 Jun 2026): the grant sweep is recited as a further instance of the existing time-based expiry of unspent float (no new independent claim); it strengthens, not alters, the no-restitution/non-transfer recitations. The tier gate is a pricing-policy layer over the existing subscription-tier element, not a new claim.</w:t>
       </w:r>
     </w:p>
     <w:p>

</xml_diff>